<commit_message>
Implemented the database logic into two form Login and Dashboard also with MDIForm
</commit_message>
<xml_diff>
--- a/Sample_doc.docx
+++ b/Sample_doc.docx
@@ -4,6 +4,9 @@
   <w:body>
     <w:p>
       <w:r>
+        <w:rPr>
+          <w:noProof/>
+        </w:rPr>
         <w:drawing>
           <wp:anchor distT="0" distB="0" distL="114300" distR="114300" simplePos="0" relativeHeight="251659264" behindDoc="0" locked="0" layoutInCell="1" allowOverlap="1" wp14:anchorId="281FEC58" wp14:editId="42298210">
             <wp:simplePos x="0" y="0"/>
@@ -59,6 +62,9 @@
     </w:p>
     <w:p>
       <w:r>
+        <w:rPr>
+          <w:noProof/>
+        </w:rPr>
         <w:drawing>
           <wp:anchor distT="0" distB="0" distL="114300" distR="114300" simplePos="0" relativeHeight="251661312" behindDoc="0" locked="0" layoutInCell="1" allowOverlap="1" wp14:anchorId="32DD7666" wp14:editId="3314A9C9">
             <wp:simplePos x="0" y="0"/>
@@ -107,6 +113,9 @@
         </w:drawing>
       </w:r>
       <w:r>
+        <w:rPr>
+          <w:noProof/>
+        </w:rPr>
         <w:drawing>
           <wp:anchor distT="0" distB="0" distL="114300" distR="114300" simplePos="0" relativeHeight="251679744" behindDoc="0" locked="0" layoutInCell="1" allowOverlap="1" wp14:anchorId="2D2236A4" wp14:editId="420F69F9">
             <wp:simplePos x="0" y="0"/>
@@ -166,6 +175,9 @@
     <w:p/>
     <w:p>
       <w:r>
+        <w:rPr>
+          <w:noProof/>
+        </w:rPr>
         <w:drawing>
           <wp:anchor distT="0" distB="0" distL="114300" distR="114300" simplePos="0" relativeHeight="251667456" behindDoc="0" locked="0" layoutInCell="1" allowOverlap="1" wp14:anchorId="5B66AAEF" wp14:editId="2EC465E3">
             <wp:simplePos x="0" y="0"/>
@@ -211,6 +223,9 @@
         </w:drawing>
       </w:r>
       <w:r>
+        <w:rPr>
+          <w:noProof/>
+        </w:rPr>
         <w:drawing>
           <wp:anchor distT="0" distB="0" distL="114300" distR="114300" simplePos="0" relativeHeight="251663360" behindDoc="0" locked="0" layoutInCell="1" allowOverlap="1" wp14:anchorId="615FE9A6" wp14:editId="15C87629">
             <wp:simplePos x="0" y="0"/>
@@ -256,6 +271,9 @@
         </w:drawing>
       </w:r>
       <w:r>
+        <w:rPr>
+          <w:noProof/>
+        </w:rPr>
         <w:drawing>
           <wp:anchor distT="0" distB="0" distL="114300" distR="114300" simplePos="0" relativeHeight="251665408" behindDoc="0" locked="0" layoutInCell="1" allowOverlap="1" wp14:anchorId="220F7B7C" wp14:editId="23342C6F">
             <wp:simplePos x="0" y="0"/>
@@ -309,6 +327,9 @@
     <w:p/>
     <w:p>
       <w:r>
+        <w:rPr>
+          <w:noProof/>
+        </w:rPr>
         <w:lastRenderedPageBreak/>
         <w:drawing>
           <wp:anchor distT="0" distB="0" distL="114300" distR="114300" simplePos="0" relativeHeight="251669504" behindDoc="0" locked="0" layoutInCell="1" allowOverlap="1" wp14:anchorId="2F46910E" wp14:editId="1408F0A7">
@@ -359,6 +380,9 @@
     <w:p/>
     <w:p>
       <w:r>
+        <w:rPr>
+          <w:noProof/>
+        </w:rPr>
         <w:drawing>
           <wp:anchor distT="0" distB="0" distL="114300" distR="114300" simplePos="0" relativeHeight="251673600" behindDoc="0" locked="0" layoutInCell="1" allowOverlap="1" wp14:anchorId="419A849E" wp14:editId="3CA4EDCE">
             <wp:simplePos x="0" y="0"/>
@@ -404,6 +428,9 @@
         </w:drawing>
       </w:r>
       <w:r>
+        <w:rPr>
+          <w:noProof/>
+        </w:rPr>
         <w:drawing>
           <wp:anchor distT="0" distB="0" distL="114300" distR="114300" simplePos="0" relativeHeight="251671552" behindDoc="0" locked="0" layoutInCell="1" allowOverlap="1" wp14:anchorId="3773767A" wp14:editId="6394E7CE">
             <wp:simplePos x="0" y="0"/>
@@ -452,6 +479,9 @@
     <w:p/>
     <w:p>
       <w:r>
+        <w:rPr>
+          <w:noProof/>
+        </w:rPr>
         <w:lastRenderedPageBreak/>
         <w:drawing>
           <wp:anchor distT="0" distB="0" distL="114300" distR="114300" simplePos="0" relativeHeight="251675648" behindDoc="0" locked="0" layoutInCell="1" allowOverlap="1" wp14:anchorId="265113A2" wp14:editId="49C5D303">
@@ -500,6 +530,9 @@
     </w:p>
     <w:p>
       <w:r>
+        <w:rPr>
+          <w:noProof/>
+        </w:rPr>
         <w:drawing>
           <wp:anchor distT="0" distB="0" distL="114300" distR="114300" simplePos="0" relativeHeight="251677696" behindDoc="0" locked="0" layoutInCell="1" allowOverlap="1" wp14:anchorId="704FA66F" wp14:editId="5B793E31">
             <wp:simplePos x="0" y="0"/>
@@ -548,6 +581,9 @@
     <w:p/>
     <w:p>
       <w:r>
+        <w:rPr>
+          <w:noProof/>
+        </w:rPr>
         <w:drawing>
           <wp:anchor distT="0" distB="0" distL="114300" distR="114300" simplePos="0" relativeHeight="251681792" behindDoc="0" locked="0" layoutInCell="1" allowOverlap="1" wp14:anchorId="4AEA7EA7" wp14:editId="11E12747">
             <wp:simplePos x="0" y="0"/>
@@ -596,7 +632,12 @@
     <w:p/>
     <w:p/>
     <w:p/>
-    <w:p/>
+    <w:p>
+      <w:r>
+        <w:lastRenderedPageBreak/>
+        <w:t>$2y$12$p8q7HzR53VveBe6RaPV8D.38eblNzIQxrByWSDP3BVZpm6KBTGnZe</w:t>
+      </w:r>
+    </w:p>
     <w:p/>
     <w:p/>
     <w:p/>

</xml_diff>